<commit_message>
Atualiza PMRA_Template_Markers.docx com versão enviada pelo usuário
https://claude.ai/code/session_01QYVgUedAdGPCf2tFmVT5S5
</commit_message>
<xml_diff>
--- a/resources/templates/PMRA_Template_Markers.docx
+++ b/resources/templates/PMRA_Template_Markers.docx
@@ -137,6 +137,38 @@
           <w:szCs w:val="20"/>
         </w:rPr>
       </w:pPr>
+      <w:r>
+        <w:rPr>
+          <w:rFonts w:ascii="Arvo" w:hAnsi="Arvo"/>
+          <w:sz w:val="20"/>
+          <w:szCs w:val="20"/>
+        </w:rPr>
+        <w:t>[SE_PF_INLINE]CPF[FIM_SE_INLINE][SE_PJ_INLINE]</w:t>
+      </w:r>
+      <w:r>
+        <w:rPr>
+          <w:rFonts w:ascii="Arvo" w:hAnsi="Arvo"/>
+          <w:sz w:val="20"/>
+          <w:szCs w:val="20"/>
+        </w:rPr>
+        <w:t>CNPJ</w:t>
+      </w:r>
+      <w:r>
+        <w:rPr>
+          <w:rFonts w:ascii="Arvo" w:hAnsi="Arvo"/>
+          <w:sz w:val="20"/>
+          <w:szCs w:val="20"/>
+        </w:rPr>
+        <w:t>[FIM_SE_INLINE]</w:t>
+      </w:r>
+      <w:r>
+        <w:rPr>
+          <w:rFonts w:ascii="Arvo" w:hAnsi="Arvo"/>
+          <w:sz w:val="20"/>
+          <w:szCs w:val="20"/>
+        </w:rPr>
+        <w:t xml:space="preserve">: </w:t>
+      </w:r>
       <w:r>
         <w:rPr>
           <w:rFonts w:ascii="Arvo" w:hAnsi="Arvo"/>
@@ -915,6 +947,7 @@
                 <w:sz w:val="20"/>
                 <w:szCs w:val="20"/>
               </w:rPr>
+              <w:lastRenderedPageBreak/>
               <w:t>Categoria</w:t>
             </w:r>
           </w:p>
@@ -993,7 +1026,6 @@
                 <w:sz w:val="20"/>
                 <w:szCs w:val="20"/>
               </w:rPr>
-              <w:lastRenderedPageBreak/>
               <w:t>[PARA_CADA_SENIORIDADE]</w:t>
             </w:r>
           </w:p>
@@ -4279,7 +4311,57 @@
           <w:sz w:val="20"/>
           <w:szCs w:val="20"/>
         </w:rPr>
-        <w:t xml:space="preserve"> O Contratante reconhece que a realização de leitura de publicações em painéis, sistemas, DJe, e/ou qualquer outro meio de publicação oficial dos órgãos do poder público, poderá acarretar no início da fluência de prazos processuais e/ou administrativos, peremptórios ou não, de modo que o Contratante isenta o Contratado de todo e qualquer prejuízo advindo da leitura de publicações realizadas pelo Contratante, notadamente em razão do escoamento do prazo em data antecipada ao que ocorreria caso o Contratante não procedesse à leitura da publicação.</w:t>
+        <w:t xml:space="preserve"> O Contratante reconhece que a realização de leitura de publicações em painéis, sistemas, </w:t>
+      </w:r>
+      <w:proofErr w:type="spellStart"/>
+      <w:r>
+        <w:rPr>
+          <w:rFonts w:ascii="Arvo" w:hAnsi="Arvo"/>
+          <w:sz w:val="20"/>
+          <w:szCs w:val="20"/>
+        </w:rPr>
+        <w:t>DJe</w:t>
+      </w:r>
+      <w:proofErr w:type="spellEnd"/>
+      <w:r>
+        <w:rPr>
+          <w:rFonts w:ascii="Arvo" w:hAnsi="Arvo"/>
+          <w:sz w:val="20"/>
+          <w:szCs w:val="20"/>
+        </w:rPr>
+        <w:t xml:space="preserve">, </w:t>
+      </w:r>
+      <w:r>
+        <w:rPr>
+          <w:rFonts w:ascii="Arvo" w:hAnsi="Arvo"/>
+          <w:sz w:val="20"/>
+          <w:szCs w:val="20"/>
+        </w:rPr>
+        <w:t xml:space="preserve">aviso de recebimento de correspondências </w:t>
+      </w:r>
+      <w:r>
+        <w:rPr>
+          <w:rFonts w:ascii="Arvo" w:hAnsi="Arvo"/>
+          <w:sz w:val="20"/>
+          <w:szCs w:val="20"/>
+        </w:rPr>
+        <w:t>e/ou qualquer outro meio de publicação oficial dos órgãos do poder público, poderá acarretar no início da fluência de prazos processuais e/ou administrativos, peremptórios ou não, de modo que o Contratante isenta o Contratado de todo e qualquer prejuízo advindo da leitura</w:t>
+      </w:r>
+      <w:r>
+        <w:rPr>
+          <w:rFonts w:ascii="Arvo" w:hAnsi="Arvo"/>
+          <w:sz w:val="20"/>
+          <w:szCs w:val="20"/>
+        </w:rPr>
+        <w:t xml:space="preserve"> ou recebimento</w:t>
+      </w:r>
+      <w:r>
+        <w:rPr>
+          <w:rFonts w:ascii="Arvo" w:hAnsi="Arvo"/>
+          <w:sz w:val="20"/>
+          <w:szCs w:val="20"/>
+        </w:rPr>
+        <w:t xml:space="preserve"> de publicações realizadas pelo Contratante, notadamente em razão do escoamento do prazo em data antecipada ao que ocorreria caso o Contratante não procedesse à leitura da publicação.</w:t>
       </w:r>
     </w:p>
     <w:p>
@@ -4944,6 +5026,7 @@
                 <w:sz w:val="20"/>
                 <w:szCs w:val="20"/>
               </w:rPr>
+              <w:lastRenderedPageBreak/>
               <w:t>Valor por Hora</w:t>
             </w:r>
           </w:p>
@@ -6173,7 +6256,16 @@
           <w:sz w:val="20"/>
           <w:szCs w:val="20"/>
         </w:rPr>
-        <w:t xml:space="preserve"> ou instrumento escrito firmado</w:t>
+        <w:t xml:space="preserve"> ou </w:t>
+      </w:r>
+      <w:r>
+        <w:rPr>
+          <w:rFonts w:ascii="Arvo" w:hAnsi="Arvo"/>
+          <w:sz w:val="20"/>
+          <w:szCs w:val="20"/>
+        </w:rPr>
+        <w:lastRenderedPageBreak/>
+        <w:t>instrumento escrito firmado</w:t>
       </w:r>
       <w:r>
         <w:rPr>
@@ -6844,6 +6936,7 @@
           <w:sz w:val="20"/>
           <w:szCs w:val="20"/>
         </w:rPr>
+        <w:lastRenderedPageBreak/>
         <w:t xml:space="preserve">As despesas incorridas pelo Contratado </w:t>
       </w:r>
       <w:r>
@@ -7490,6 +7583,7 @@
           <w:sz w:val="20"/>
           <w:szCs w:val="20"/>
         </w:rPr>
+        <w:lastRenderedPageBreak/>
         <w:t xml:space="preserve">Abster-se de atuar em demandas em que se verifique incompatibilidade </w:t>
       </w:r>
       <w:r>
@@ -7543,7 +7637,6 @@
           <w:sz w:val="20"/>
           <w:szCs w:val="20"/>
         </w:rPr>
-        <w:lastRenderedPageBreak/>
         <w:t>Emitir os documentos fiscais correspondentes aos honorários e despesas cobrados, na forma da legislação tributária aplicável.</w:t>
       </w:r>
     </w:p>
@@ -7944,6 +8037,7 @@
           <w:sz w:val="20"/>
           <w:szCs w:val="20"/>
         </w:rPr>
+        <w:lastRenderedPageBreak/>
         <w:t>CONFIDENCIALIDADE</w:t>
       </w:r>
     </w:p>
@@ -7981,16 +8075,7 @@
           <w:sz w:val="20"/>
           <w:szCs w:val="20"/>
         </w:rPr>
-        <w:t xml:space="preserve">Consideram-se Informações Confidenciais todas as informações, dados, documentos, opiniões, pareceres, minutas, estratégias, know-how e demais conteúdos, em qualquer forma ou meio, compartilhados entre as Partes ou por elas elaborados em razão da presente </w:t>
-      </w:r>
-      <w:r>
-        <w:rPr>
-          <w:rFonts w:ascii="Arvo" w:hAnsi="Arvo"/>
-          <w:sz w:val="20"/>
-          <w:szCs w:val="20"/>
-        </w:rPr>
-        <w:lastRenderedPageBreak/>
-        <w:t>contratação, bem como aqueles tratados como tais pela Parte divulgadora ou que, por sua natureza, devam ser assim considerados.</w:t>
+        <w:t>Consideram-se Informações Confidenciais todas as informações, dados, documentos, opiniões, pareceres, minutas, estratégias, know-how e demais conteúdos, em qualquer forma ou meio, compartilhados entre as Partes ou por elas elaborados em razão da presente contratação, bem como aqueles tratados como tais pela Parte divulgadora ou que, por sua natureza, devam ser assim considerados.</w:t>
       </w:r>
     </w:p>
     <w:p>
@@ -8314,7 +8399,16 @@
           <w:sz w:val="20"/>
           <w:szCs w:val="20"/>
         </w:rPr>
-        <w:t xml:space="preserve"> fora das hipóteses legais ou contratuais, a submeter eventuais suboperadores a obrigações equivalentes e a notificar a outra Parte, em até 24 (vinte e quatro) horas da ciência, de qualquer incidente de segurança envolvendo dados pessoais desta contratação.</w:t>
+        <w:t xml:space="preserve"> fora das hipóteses legais ou contratuais, a submeter eventuais suboperadores a obrigações equivalentes e a notificar a outra Parte, em até 24 (vinte e quatro) </w:t>
+      </w:r>
+      <w:r>
+        <w:rPr>
+          <w:rFonts w:ascii="Arvo" w:hAnsi="Arvo"/>
+          <w:sz w:val="20"/>
+          <w:szCs w:val="20"/>
+        </w:rPr>
+        <w:lastRenderedPageBreak/>
+        <w:t>horas da ciência, de qualquer incidente de segurança envolvendo dados pessoais desta contratação.</w:t>
       </w:r>
     </w:p>
     <w:p>
@@ -8351,7 +8445,6 @@
           <w:sz w:val="20"/>
           <w:szCs w:val="20"/>
         </w:rPr>
-        <w:lastRenderedPageBreak/>
         <w:t>As Partes cooperarão de boa-fé para o atendimento das requisições dos titulares de dados e das autoridades competentes, respondendo cada qual, na respectiva medida de responsabilidade, pelos ônus decorrentes do descumprimento desta cláusula.</w:t>
       </w:r>
     </w:p>
@@ -8427,7 +8520,39 @@
           <w:sz w:val="20"/>
           <w:szCs w:val="20"/>
         </w:rPr>
-        <w:t>A responsabilidade do Contratado limita-se aos danos diretos e efetivamente comprovados decorrentes de culpa ou dolo na execução dos serviços, excluídos, expressamente, os danos indiretos, lucros cessantes, perda de chance, danos reflexos e demais danos consequenciais, salvo nas hipóteses em que a lei vedar a limitação de responsabilidade.</w:t>
+        <w:t>A responsabilidade do Contratado</w:t>
+      </w:r>
+      <w:r>
+        <w:rPr>
+          <w:rFonts w:ascii="Arvo" w:hAnsi="Arvo"/>
+          <w:sz w:val="20"/>
+          <w:szCs w:val="20"/>
+        </w:rPr>
+        <w:t>, em qualquer hipótese, fica limitada ao valor total efetivamente pago pelo Contratante</w:t>
+      </w:r>
+      <w:r>
+        <w:rPr>
+          <w:rFonts w:ascii="Arvo" w:hAnsi="Arvo"/>
+          <w:sz w:val="20"/>
+          <w:szCs w:val="20"/>
+        </w:rPr>
+        <w:t xml:space="preserve"> ao Contratado</w:t>
+      </w:r>
+      <w:r>
+        <w:rPr>
+          <w:rFonts w:ascii="Arvo" w:hAnsi="Arvo"/>
+          <w:sz w:val="20"/>
+          <w:szCs w:val="20"/>
+        </w:rPr>
+        <w:t xml:space="preserve"> nos 12 (doze) meses anteriores, respondendo exclusivamente por danos diretos e efetivamente comprovados decorrentes de culpa ou dolo na execução dos serviços. Ficam expressamente excluídos quaisquer danos indiretos, lucros cessantes, perda de chance, danos reflexos e</w:t>
+      </w:r>
+      <w:r>
+        <w:rPr>
+          <w:rFonts w:ascii="Arvo" w:hAnsi="Arvo"/>
+          <w:sz w:val="20"/>
+          <w:szCs w:val="20"/>
+        </w:rPr>
+        <w:t xml:space="preserve"> danos consequenciais, salvo nas hipóteses em que a lei vedar a limitação de responsabilidade.</w:t>
       </w:r>
     </w:p>
     <w:p>
@@ -8808,6 +8933,7 @@
           <w:sz w:val="20"/>
           <w:szCs w:val="20"/>
         </w:rPr>
+        <w:lastRenderedPageBreak/>
         <w:t xml:space="preserve">A declarada nulidade, invalidade ou ineficácia de qualquer disposição não afetará as demais, permanecendo </w:t>
       </w:r>
       <w:r>
@@ -8861,7 +8987,6 @@
           <w:sz w:val="20"/>
           <w:szCs w:val="20"/>
         </w:rPr>
-        <w:lastRenderedPageBreak/>
         <w:t>As comunicações relativas a est</w:t>
       </w:r>
       <w:r>
@@ -9531,6 +9656,7 @@
                 <w:sz w:val="20"/>
                 <w:szCs w:val="20"/>
               </w:rPr>
+              <w:lastRenderedPageBreak/>
               <w:t>____________________________________________</w:t>
             </w:r>
           </w:p>
@@ -9587,9 +9713,12 @@
       </w:pPr>
     </w:p>
     <w:sectPr>
-      <w:headerReference w:type="default" r:id="rId10"/>
-      <w:footerReference w:type="even" r:id="rId11"/>
-      <w:footerReference w:type="default" r:id="rId12"/>
+      <w:headerReference w:type="even" r:id="rId10"/>
+      <w:headerReference w:type="default" r:id="rId11"/>
+      <w:footerReference w:type="even" r:id="rId12"/>
+      <w:footerReference w:type="default" r:id="rId13"/>
+      <w:headerReference w:type="first" r:id="rId14"/>
+      <w:footerReference w:type="first" r:id="rId15"/>
       <w:pgSz w:w="11906" w:h="16838"/>
       <w:pgMar w:top="2268" w:right="1134" w:bottom="2268" w:left="1134" w:header="720" w:footer="720" w:gutter="0"/>
       <w:cols w:space="720"/>
@@ -9745,6 +9874,16 @@
 </w:ftr>
 </file>
 
+<file path=word/footer3.xml><?xml version="1.0" encoding="utf-8"?>
+<w:ftr xmlns:wpc="http://schemas.microsoft.com/office/word/2010/wordprocessingCanvas" xmlns:cx="http://schemas.microsoft.com/office/drawing/2014/chartex" xmlns:cx1="http://schemas.microsoft.com/office/drawing/2015/9/8/chartex" xmlns:cx2="http://schemas.microsoft.com/office/drawing/2015/10/21/chartex" xmlns:cx3="http://schemas.microsoft.com/office/drawing/2016/5/9/chartex" xmlns:cx4="http://schemas.microsoft.com/office/drawing/2016/5/10/chartex" xmlns:cx5="http://schemas.microsoft.com/office/drawing/2016/5/11/chartex" xmlns:cx6="http://schemas.microsoft.com/office/drawing/2016/5/12/chartex" xmlns:cx7="http://schemas.microsoft.com/office/drawing/2016/5/13/chartex" xmlns:cx8="http://schemas.microsoft.com/office/drawing/2016/5/14/chartex" xmlns:mc="http://schemas.openxmlformats.org/markup-compatibility/2006" xmlns:aink="http://schemas.microsoft.com/office/drawing/2016/ink" xmlns:am3d="http://schemas.microsoft.com/office/drawing/2017/model3d" xmlns:o="urn:schemas-microsoft-com:office:office" xmlns:oel="http://schemas.microsoft.com/office/2019/extlst" xmlns:r="http://schemas.openxmlformats.org/officeDocument/2006/relationships" xmlns:m="http://schemas.openxmlformats.org/officeDocument/2006/math" xmlns:v="urn:schemas-microsoft-com:vml" xmlns:wp14="http://schemas.microsoft.com/office/word/2010/wordprocessingDrawing" xmlns:wp="http://schemas.openxmlformats.org/drawingml/2006/wordprocessingDrawing" xmlns:w10="urn:schemas-microsoft-com:office:word" xmlns:w="http://schemas.openxmlformats.org/wordprocessingml/2006/main" xmlns:w14="http://schemas.microsoft.com/office/word/2010/wordml" xmlns:w15="http://schemas.microsoft.com/office/word/2012/wordml" xmlns:w16cex="http://schemas.microsoft.com/office/word/2018/wordml/cex" xmlns:w16cid="http://schemas.microsoft.com/office/word/2016/wordml/cid" xmlns:w16="http://schemas.microsoft.com/office/word/2018/wordml" xmlns:w16du="http://schemas.microsoft.com/office/word/2023/wordml/word16du" xmlns:w16sdtdh="http://schemas.microsoft.com/office/word/2020/wordml/sdtdatahash" xmlns:w16sdtfl="http://schemas.microsoft.com/office/word/2024/wordml/sdtformatlock" xmlns:w16se="http://schemas.microsoft.com/office/word/2015/wordml/symex" xmlns:wpg="http://schemas.microsoft.com/office/word/2010/wordprocessingGroup" xmlns:wpi="http://schemas.microsoft.com/office/word/2010/wordprocessingInk" xmlns:wne="http://schemas.microsoft.com/office/word/2006/wordml" xmlns:wps="http://schemas.microsoft.com/office/word/2010/wordprocessingShape" mc:Ignorable="w14 w15 w16se w16cid w16 w16cex w16sdtdh w16sdtfl w16du wp14">
+  <w:p>
+    <w:pPr>
+      <w:pStyle w:val="Rodap"/>
+    </w:pPr>
+  </w:p>
+</w:ftr>
+</file>
+
 <file path=word/footnotes.xml><?xml version="1.0" encoding="utf-8"?>
 <w:footnotes xmlns:wpc="http://schemas.microsoft.com/office/word/2010/wordprocessingCanvas" xmlns:cx="http://schemas.microsoft.com/office/drawing/2014/chartex" xmlns:cx1="http://schemas.microsoft.com/office/drawing/2015/9/8/chartex" xmlns:cx2="http://schemas.microsoft.com/office/drawing/2015/10/21/chartex" xmlns:cx3="http://schemas.microsoft.com/office/drawing/2016/5/9/chartex" xmlns:cx4="http://schemas.microsoft.com/office/drawing/2016/5/10/chartex" xmlns:cx5="http://schemas.microsoft.com/office/drawing/2016/5/11/chartex" xmlns:cx6="http://schemas.microsoft.com/office/drawing/2016/5/12/chartex" xmlns:cx7="http://schemas.microsoft.com/office/drawing/2016/5/13/chartex" xmlns:cx8="http://schemas.microsoft.com/office/drawing/2016/5/14/chartex" xmlns:mc="http://schemas.openxmlformats.org/markup-compatibility/2006" xmlns:aink="http://schemas.microsoft.com/office/drawing/2016/ink" xmlns:am3d="http://schemas.microsoft.com/office/drawing/2017/model3d" xmlns:o="urn:schemas-microsoft-com:office:office" xmlns:oel="http://schemas.microsoft.com/office/2019/extlst" xmlns:r="http://schemas.openxmlformats.org/officeDocument/2006/relationships" xmlns:m="http://schemas.openxmlformats.org/officeDocument/2006/math" xmlns:v="urn:schemas-microsoft-com:vml" xmlns:wp14="http://schemas.microsoft.com/office/word/2010/wordprocessingDrawing" xmlns:wp="http://schemas.openxmlformats.org/drawingml/2006/wordprocessingDrawing" xmlns:w10="urn:schemas-microsoft-com:office:word" xmlns:w="http://schemas.openxmlformats.org/wordprocessingml/2006/main" xmlns:w14="http://schemas.microsoft.com/office/word/2010/wordml" xmlns:w15="http://schemas.microsoft.com/office/word/2012/wordml" xmlns:w16cex="http://schemas.microsoft.com/office/word/2018/wordml/cex" xmlns:w16cid="http://schemas.microsoft.com/office/word/2016/wordml/cid" xmlns:w16="http://schemas.microsoft.com/office/word/2018/wordml" xmlns:w16du="http://schemas.microsoft.com/office/word/2023/wordml/word16du" xmlns:w16sdtdh="http://schemas.microsoft.com/office/word/2020/wordml/sdtdatahash" xmlns:w16sdtfl="http://schemas.microsoft.com/office/word/2024/wordml/sdtformatlock" xmlns:w16se="http://schemas.microsoft.com/office/word/2015/wordml/symex" xmlns:wpg="http://schemas.microsoft.com/office/word/2010/wordprocessingGroup" xmlns:wpi="http://schemas.microsoft.com/office/word/2010/wordprocessingInk" xmlns:wne="http://schemas.microsoft.com/office/word/2006/wordml" xmlns:wps="http://schemas.microsoft.com/office/word/2010/wordprocessingShape" mc:Ignorable="w14 w15 w16se w16cid w16 w16cex w16sdtdh w16sdtfl w16du wp14">
   <w:footnote w:type="separator" w:id="-1">
@@ -9765,6 +9904,16 @@
 </file>
 
 <file path=word/header1.xml><?xml version="1.0" encoding="utf-8"?>
+<w:hdr xmlns:wpc="http://schemas.microsoft.com/office/word/2010/wordprocessingCanvas" xmlns:cx="http://schemas.microsoft.com/office/drawing/2014/chartex" xmlns:cx1="http://schemas.microsoft.com/office/drawing/2015/9/8/chartex" xmlns:cx2="http://schemas.microsoft.com/office/drawing/2015/10/21/chartex" xmlns:cx3="http://schemas.microsoft.com/office/drawing/2016/5/9/chartex" xmlns:cx4="http://schemas.microsoft.com/office/drawing/2016/5/10/chartex" xmlns:cx5="http://schemas.microsoft.com/office/drawing/2016/5/11/chartex" xmlns:cx6="http://schemas.microsoft.com/office/drawing/2016/5/12/chartex" xmlns:cx7="http://schemas.microsoft.com/office/drawing/2016/5/13/chartex" xmlns:cx8="http://schemas.microsoft.com/office/drawing/2016/5/14/chartex" xmlns:mc="http://schemas.openxmlformats.org/markup-compatibility/2006" xmlns:aink="http://schemas.microsoft.com/office/drawing/2016/ink" xmlns:am3d="http://schemas.microsoft.com/office/drawing/2017/model3d" xmlns:o="urn:schemas-microsoft-com:office:office" xmlns:oel="http://schemas.microsoft.com/office/2019/extlst" xmlns:r="http://schemas.openxmlformats.org/officeDocument/2006/relationships" xmlns:m="http://schemas.openxmlformats.org/officeDocument/2006/math" xmlns:v="urn:schemas-microsoft-com:vml" xmlns:wp14="http://schemas.microsoft.com/office/word/2010/wordprocessingDrawing" xmlns:wp="http://schemas.openxmlformats.org/drawingml/2006/wordprocessingDrawing" xmlns:w10="urn:schemas-microsoft-com:office:word" xmlns:w="http://schemas.openxmlformats.org/wordprocessingml/2006/main" xmlns:w14="http://schemas.microsoft.com/office/word/2010/wordml" xmlns:w15="http://schemas.microsoft.com/office/word/2012/wordml" xmlns:w16cex="http://schemas.microsoft.com/office/word/2018/wordml/cex" xmlns:w16cid="http://schemas.microsoft.com/office/word/2016/wordml/cid" xmlns:w16="http://schemas.microsoft.com/office/word/2018/wordml" xmlns:w16du="http://schemas.microsoft.com/office/word/2023/wordml/word16du" xmlns:w16sdtdh="http://schemas.microsoft.com/office/word/2020/wordml/sdtdatahash" xmlns:w16sdtfl="http://schemas.microsoft.com/office/word/2024/wordml/sdtformatlock" xmlns:w16se="http://schemas.microsoft.com/office/word/2015/wordml/symex" xmlns:wpg="http://schemas.microsoft.com/office/word/2010/wordprocessingGroup" xmlns:wpi="http://schemas.microsoft.com/office/word/2010/wordprocessingInk" xmlns:wne="http://schemas.microsoft.com/office/word/2006/wordml" xmlns:wps="http://schemas.microsoft.com/office/word/2010/wordprocessingShape" mc:Ignorable="w14 w15 w16se w16cid w16 w16cex w16sdtdh w16sdtfl w16du wp14">
+  <w:p>
+    <w:pPr>
+      <w:pStyle w:val="Cabealho"/>
+    </w:pPr>
+  </w:p>
+</w:hdr>
+</file>
+
+<file path=word/header2.xml><?xml version="1.0" encoding="utf-8"?>
 <w:hdr xmlns:wpc="http://schemas.microsoft.com/office/word/2010/wordprocessingCanvas" xmlns:cx="http://schemas.microsoft.com/office/drawing/2014/chartex" xmlns:cx1="http://schemas.microsoft.com/office/drawing/2015/9/8/chartex" xmlns:cx2="http://schemas.microsoft.com/office/drawing/2015/10/21/chartex" xmlns:cx3="http://schemas.microsoft.com/office/drawing/2016/5/9/chartex" xmlns:cx4="http://schemas.microsoft.com/office/drawing/2016/5/10/chartex" xmlns:cx5="http://schemas.microsoft.com/office/drawing/2016/5/11/chartex" xmlns:cx6="http://schemas.microsoft.com/office/drawing/2016/5/12/chartex" xmlns:cx7="http://schemas.microsoft.com/office/drawing/2016/5/13/chartex" xmlns:cx8="http://schemas.microsoft.com/office/drawing/2016/5/14/chartex" xmlns:mc="http://schemas.openxmlformats.org/markup-compatibility/2006" xmlns:aink="http://schemas.microsoft.com/office/drawing/2016/ink" xmlns:am3d="http://schemas.microsoft.com/office/drawing/2017/model3d" xmlns:o="urn:schemas-microsoft-com:office:office" xmlns:oel="http://schemas.microsoft.com/office/2019/extlst" xmlns:r="http://schemas.openxmlformats.org/officeDocument/2006/relationships" xmlns:m="http://schemas.openxmlformats.org/officeDocument/2006/math" xmlns:v="urn:schemas-microsoft-com:vml" xmlns:wp14="http://schemas.microsoft.com/office/word/2010/wordprocessingDrawing" xmlns:wp="http://schemas.openxmlformats.org/drawingml/2006/wordprocessingDrawing" xmlns:w10="urn:schemas-microsoft-com:office:word" xmlns:w="http://schemas.openxmlformats.org/wordprocessingml/2006/main" xmlns:w14="http://schemas.microsoft.com/office/word/2010/wordml" xmlns:w15="http://schemas.microsoft.com/office/word/2012/wordml" xmlns:w16cex="http://schemas.microsoft.com/office/word/2018/wordml/cex" xmlns:w16cid="http://schemas.microsoft.com/office/word/2016/wordml/cid" xmlns:w16="http://schemas.microsoft.com/office/word/2018/wordml" xmlns:w16du="http://schemas.microsoft.com/office/word/2023/wordml/word16du" xmlns:w16sdtdh="http://schemas.microsoft.com/office/word/2020/wordml/sdtdatahash" xmlns:w16sdtfl="http://schemas.microsoft.com/office/word/2024/wordml/sdtformatlock" xmlns:w16se="http://schemas.microsoft.com/office/word/2015/wordml/symex" xmlns:wpg="http://schemas.microsoft.com/office/word/2010/wordprocessingGroup" xmlns:wpi="http://schemas.microsoft.com/office/word/2010/wordprocessingInk" xmlns:wne="http://schemas.microsoft.com/office/word/2006/wordml" xmlns:wps="http://schemas.microsoft.com/office/word/2010/wordprocessingShape" mc:Ignorable="w14 w15 w16se w16cid w16 w16cex w16sdtdh w16sdtfl w16du wp14">
   <w:p>
     <w:r>
@@ -9832,6 +9981,16 @@
 </w:hdr>
 </file>
 
+<file path=word/header3.xml><?xml version="1.0" encoding="utf-8"?>
+<w:hdr xmlns:wpc="http://schemas.microsoft.com/office/word/2010/wordprocessingCanvas" xmlns:cx="http://schemas.microsoft.com/office/drawing/2014/chartex" xmlns:cx1="http://schemas.microsoft.com/office/drawing/2015/9/8/chartex" xmlns:cx2="http://schemas.microsoft.com/office/drawing/2015/10/21/chartex" xmlns:cx3="http://schemas.microsoft.com/office/drawing/2016/5/9/chartex" xmlns:cx4="http://schemas.microsoft.com/office/drawing/2016/5/10/chartex" xmlns:cx5="http://schemas.microsoft.com/office/drawing/2016/5/11/chartex" xmlns:cx6="http://schemas.microsoft.com/office/drawing/2016/5/12/chartex" xmlns:cx7="http://schemas.microsoft.com/office/drawing/2016/5/13/chartex" xmlns:cx8="http://schemas.microsoft.com/office/drawing/2016/5/14/chartex" xmlns:mc="http://schemas.openxmlformats.org/markup-compatibility/2006" xmlns:aink="http://schemas.microsoft.com/office/drawing/2016/ink" xmlns:am3d="http://schemas.microsoft.com/office/drawing/2017/model3d" xmlns:o="urn:schemas-microsoft-com:office:office" xmlns:oel="http://schemas.microsoft.com/office/2019/extlst" xmlns:r="http://schemas.openxmlformats.org/officeDocument/2006/relationships" xmlns:m="http://schemas.openxmlformats.org/officeDocument/2006/math" xmlns:v="urn:schemas-microsoft-com:vml" xmlns:wp14="http://schemas.microsoft.com/office/word/2010/wordprocessingDrawing" xmlns:wp="http://schemas.openxmlformats.org/drawingml/2006/wordprocessingDrawing" xmlns:w10="urn:schemas-microsoft-com:office:word" xmlns:w="http://schemas.openxmlformats.org/wordprocessingml/2006/main" xmlns:w14="http://schemas.microsoft.com/office/word/2010/wordml" xmlns:w15="http://schemas.microsoft.com/office/word/2012/wordml" xmlns:w16cex="http://schemas.microsoft.com/office/word/2018/wordml/cex" xmlns:w16cid="http://schemas.microsoft.com/office/word/2016/wordml/cid" xmlns:w16="http://schemas.microsoft.com/office/word/2018/wordml" xmlns:w16du="http://schemas.microsoft.com/office/word/2023/wordml/word16du" xmlns:w16sdtdh="http://schemas.microsoft.com/office/word/2020/wordml/sdtdatahash" xmlns:w16sdtfl="http://schemas.microsoft.com/office/word/2024/wordml/sdtformatlock" xmlns:w16se="http://schemas.microsoft.com/office/word/2015/wordml/symex" xmlns:wpg="http://schemas.microsoft.com/office/word/2010/wordprocessingGroup" xmlns:wpi="http://schemas.microsoft.com/office/word/2010/wordprocessingInk" xmlns:wne="http://schemas.microsoft.com/office/word/2006/wordml" xmlns:wps="http://schemas.microsoft.com/office/word/2010/wordprocessingShape" mc:Ignorable="w14 w15 w16se w16cid w16 w16cex w16sdtdh w16sdtfl w16du wp14">
+  <w:p>
+    <w:pPr>
+      <w:pStyle w:val="Cabealho"/>
+    </w:pPr>
+  </w:p>
+</w:hdr>
+</file>
+
 <file path=word/numbering.xml><?xml version="1.0" encoding="utf-8"?>
 <w:numbering xmlns:wpc="http://schemas.microsoft.com/office/word/2010/wordprocessingCanvas" xmlns:cx="http://schemas.microsoft.com/office/drawing/2014/chartex" xmlns:cx1="http://schemas.microsoft.com/office/drawing/2015/9/8/chartex" xmlns:cx2="http://schemas.microsoft.com/office/drawing/2015/10/21/chartex" xmlns:cx3="http://schemas.microsoft.com/office/drawing/2016/5/9/chartex" xmlns:cx4="http://schemas.microsoft.com/office/drawing/2016/5/10/chartex" xmlns:cx5="http://schemas.microsoft.com/office/drawing/2016/5/11/chartex" xmlns:cx6="http://schemas.microsoft.com/office/drawing/2016/5/12/chartex" xmlns:cx7="http://schemas.microsoft.com/office/drawing/2016/5/13/chartex" xmlns:cx8="http://schemas.microsoft.com/office/drawing/2016/5/14/chartex" xmlns:mc="http://schemas.openxmlformats.org/markup-compatibility/2006" xmlns:aink="http://schemas.microsoft.com/office/drawing/2016/ink" xmlns:am3d="http://schemas.microsoft.com/office/drawing/2017/model3d" xmlns:o="urn:schemas-microsoft-com:office:office" xmlns:oel="http://schemas.microsoft.com/office/2019/extlst" xmlns:r="http://schemas.openxmlformats.org/officeDocument/2006/relationships" xmlns:m="http://schemas.openxmlformats.org/officeDocument/2006/math" xmlns:v="urn:schemas-microsoft-com:vml" xmlns:wp14="http://schemas.microsoft.com/office/word/2010/wordprocessingDrawing" xmlns:wp="http://schemas.openxmlformats.org/drawingml/2006/wordprocessingDrawing" xmlns:w10="urn:schemas-microsoft-com:office:word" xmlns:w="http://schemas.openxmlformats.org/wordprocessingml/2006/main" xmlns:w14="http://schemas.microsoft.com/office/word/2010/wordml" xmlns:w15="http://schemas.microsoft.com/office/word/2012/wordml" xmlns:w16cex="http://schemas.microsoft.com/office/word/2018/wordml/cex" xmlns:w16cid="http://schemas.microsoft.com/office/word/2016/wordml/cid" xmlns:w16="http://schemas.microsoft.com/office/word/2018/wordml" xmlns:w16du="http://schemas.microsoft.com/office/word/2023/wordml/word16du" xmlns:w16sdtdh="http://schemas.microsoft.com/office/word/2020/wordml/sdtdatahash" xmlns:w16sdtfl="http://schemas.microsoft.com/office/word/2024/wordml/sdtformatlock" xmlns:w16se="http://schemas.microsoft.com/office/word/2015/wordml/symex" xmlns:wpg="http://schemas.microsoft.com/office/word/2010/wordprocessingGroup" xmlns:wpi="http://schemas.microsoft.com/office/word/2010/wordprocessingInk" xmlns:wne="http://schemas.microsoft.com/office/word/2006/wordml" xmlns:wps="http://schemas.microsoft.com/office/word/2010/wordprocessingShape" mc:Ignorable="w14 w15 w16se w16cid w16 w16cex w16sdtdh w16sdtfl w16du wp14">
   <w:abstractNum w:abstractNumId="0" w15:restartNumberingAfterBreak="0">
@@ -10059,7 +10218,7 @@
   <w:docDefaults>
     <w:rPrDefault>
       <w:rPr>
-        <w:rFonts w:ascii="Arvo" w:eastAsia="Arvo" w:hAnsi="Arvo" w:cs="Arvo"/>
+        <w:rFonts w:ascii="Arial Narrow" w:eastAsia="Arial Narrow" w:hAnsi="Arial Narrow" w:cs="Arial Narrow"/>
         <w:sz w:val="22"/>
         <w:szCs w:val="22"/>
         <w:lang w:val="pt-BR" w:eastAsia="pt-BR" w:bidi="ar-SA"/>

</xml_diff>

<commit_message>
Atualiza Markers template com lógica de múltiplos escopos
scripts/markers_map.py:
- Variáveis novas: [ESCOPO_LETRA], [ESCOPO_DESCRICAO], [HONORARIO_BLOCO]
- Condicionais novas (4 modos por modalidade): [SE_*_ESCOPO_UNICO],
  [SE_*_MULTI_ESCOPOS], [SE_*_FORMA_UNICA], [SE_*_FORMA_POR_ESCOPO]
- Loop paragraph-level: nova categoria PARA_CADA_P para suportar
  {%p for %}/{%p endfor %} (texto descritivo de escopos e blocos de
  honorários por escopo)
- Markers: [PARA_CADA_ESCOPO_CONSULTIVO], [PARA_CADA_ESCOPO_CONTENCIOSO],
  [PARA_CADA_HONORARIO_CONSULTIVO], [PARA_CADA_HONORARIO_CONTENCIOSO]
- Marker de fim distinto para loops paragraph-level: [FIM_PARA_CADA_BLOCO]
  (diferente de [FIM_PARA_CADA] que fecha loops table-row-level)

resources/templates/PMRA_Template_Markers.docx regenerado via
scripts/to_markers.py. Round-trip Markers→Jinja gera as mesmas 79 tags
Jinja do template atual (validado).

https://claude.ai/code/session_012AQuGGrkZo1QrHGcyvhfSB
</commit_message>
<xml_diff>
--- a/resources/templates/PMRA_Template_Markers.docx
+++ b/resources/templates/PMRA_Template_Markers.docx
@@ -435,7 +435,7 @@
           <w:sz w:val="2"/>
           <w:szCs w:val="2"/>
         </w:rPr>
-        <w:t>[SE_CONSULTIVA]</w:t>
+        <w:t>[SE_CONSULTIVA_ESCOPO_UNICO]</w:t>
       </w:r>
     </w:p>
     <w:p>
@@ -534,17 +534,6 @@
     </w:p>
     <w:p>
       <w:pPr>
-        <w:snapToGrid w:val="0"/>
-        <w:spacing w:line="276" w:lineRule="auto"/>
-        <w:rPr>
-          <w:rFonts w:ascii="Arvo" w:hAnsi="Arvo"/>
-          <w:sz w:val="20"/>
-          <w:szCs w:val="20"/>
-        </w:rPr>
-      </w:pPr>
-    </w:p>
-    <w:p>
-      <w:pPr>
         <w:spacing w:line="276" w:lineRule="auto"/>
         <w:rPr>
           <w:rFonts w:ascii="Arvo" w:hAnsi="Arvo"/>
@@ -558,14 +547,38 @@
           <w:sz w:val="2"/>
           <w:szCs w:val="2"/>
         </w:rPr>
-        <w:t>[SE_SLA]</w:t>
-      </w:r>
-    </w:p>
-    <w:p>
-      <w:pPr>
-        <w:keepNext/>
-        <w:snapToGrid w:val="0"/>
-        <w:spacing w:line="276" w:lineRule="auto"/>
+        <w:t>[SE_CONSULTIVA_MULTI_ESCOPOS]</w:t>
+      </w:r>
+    </w:p>
+    <w:p>
+      <w:pPr>
+        <w:spacing w:line="276" w:lineRule="auto"/>
+        <w:rPr>
+          <w:rFonts w:ascii="Arvo" w:hAnsi="Arvo"/>
+          <w:sz w:val="2"/>
+          <w:szCs w:val="2"/>
+        </w:rPr>
+      </w:pPr>
+      <w:r>
+        <w:rPr>
+          <w:rFonts w:ascii="Arvo" w:hAnsi="Arvo"/>
+          <w:sz w:val="2"/>
+          <w:szCs w:val="2"/>
+        </w:rPr>
+        <w:t>[PARA_CADA_ESCOPO_CONSULTIVO]</w:t>
+      </w:r>
+    </w:p>
+    <w:p>
+      <w:pPr>
+        <w:spacing w:line="276" w:lineRule="auto"/>
+        <w:rPr>
+          <w:rFonts w:ascii="Arvo" w:hAnsi="Arvo"/>
+          <w:sz w:val="20"/>
+          <w:szCs w:val="20"/>
+        </w:rPr>
+        <w:jc w:val="both"/>
+      </w:pPr>
+      <w:r>
         <w:rPr>
           <w:rFonts w:ascii="Arvo" w:hAnsi="Arvo"/>
           <w:b/>
@@ -573,8 +586,118 @@
           <w:sz w:val="20"/>
           <w:szCs w:val="20"/>
         </w:rPr>
-      </w:pPr>
-      <w:r>
+        <w:t xml:space="preserve">Escopo Consultivo [ESCOPO_LETRA]:</w:t>
+      </w:r>
+    </w:p>
+    <w:p>
+      <w:pPr>
+        <w:spacing w:line="276" w:lineRule="auto"/>
+        <w:rPr>
+          <w:rFonts w:ascii="Arvo" w:hAnsi="Arvo"/>
+          <w:sz w:val="20"/>
+          <w:szCs w:val="20"/>
+        </w:rPr>
+      </w:pPr>
+    </w:p>
+    <w:p>
+      <w:pPr>
+        <w:spacing w:line="276" w:lineRule="auto"/>
+        <w:rPr>
+          <w:rFonts w:ascii="Arvo" w:hAnsi="Arvo"/>
+          <w:sz w:val="20"/>
+          <w:szCs w:val="20"/>
+        </w:rPr>
+        <w:jc w:val="both"/>
+      </w:pPr>
+      <w:r>
+        <w:rPr>
+          <w:rFonts w:ascii="Arvo" w:hAnsi="Arvo"/>
+          <w:sz w:val="20"/>
+          <w:szCs w:val="20"/>
+        </w:rPr>
+        <w:t xml:space="preserve">[ESCOPO_DESCRICAO]</w:t>
+      </w:r>
+    </w:p>
+    <w:p>
+      <w:pPr>
+        <w:spacing w:line="276" w:lineRule="auto"/>
+        <w:rPr>
+          <w:rFonts w:ascii="Arvo" w:hAnsi="Arvo"/>
+          <w:sz w:val="20"/>
+          <w:szCs w:val="20"/>
+        </w:rPr>
+      </w:pPr>
+    </w:p>
+    <w:p>
+      <w:pPr>
+        <w:spacing w:line="276" w:lineRule="auto"/>
+        <w:rPr>
+          <w:rFonts w:ascii="Arvo" w:hAnsi="Arvo"/>
+          <w:sz w:val="2"/>
+          <w:szCs w:val="2"/>
+        </w:rPr>
+      </w:pPr>
+      <w:r>
+        <w:rPr>
+          <w:rFonts w:ascii="Arvo" w:hAnsi="Arvo"/>
+          <w:sz w:val="2"/>
+          <w:szCs w:val="2"/>
+        </w:rPr>
+        <w:t>[FIM_PARA_CADA_BLOCO]</w:t>
+      </w:r>
+    </w:p>
+    <w:p>
+      <w:pPr>
+        <w:spacing w:line="276" w:lineRule="auto"/>
+        <w:rPr>
+          <w:rFonts w:ascii="Arvo" w:hAnsi="Arvo"/>
+          <w:sz w:val="2"/>
+          <w:szCs w:val="2"/>
+        </w:rPr>
+      </w:pPr>
+      <w:r>
+        <w:rPr>
+          <w:rFonts w:ascii="Arvo" w:hAnsi="Arvo"/>
+          <w:sz w:val="2"/>
+          <w:szCs w:val="2"/>
+        </w:rPr>
+        <w:t>[FIM_SE]</w:t>
+      </w:r>
+    </w:p>
+    <w:p>
+      <w:pPr>
+        <w:snapToGrid w:val="0"/>
+        <w:spacing w:line="276" w:lineRule="auto"/>
+        <w:rPr>
+          <w:rFonts w:ascii="Arvo" w:hAnsi="Arvo"/>
+          <w:sz w:val="20"/>
+          <w:szCs w:val="20"/>
+        </w:rPr>
+      </w:pPr>
+    </w:p>
+    <w:p>
+      <w:pPr>
+        <w:spacing w:line="276" w:lineRule="auto"/>
+        <w:rPr>
+          <w:rFonts w:ascii="Arvo" w:hAnsi="Arvo"/>
+          <w:sz w:val="2"/>
+          <w:szCs w:val="2"/>
+        </w:rPr>
+      </w:pPr>
+      <w:r>
+        <w:rPr>
+          <w:rFonts w:ascii="Arvo" w:hAnsi="Arvo"/>
+          <w:sz w:val="2"/>
+          <w:szCs w:val="2"/>
+        </w:rPr>
+        <w:t>[SE_SLA]</w:t>
+      </w:r>
+    </w:p>
+    <w:p>
+      <w:pPr>
+        <w:keepNext/>
+        <w:snapToGrid w:val="0"/>
+        <w:spacing w:line="276" w:lineRule="auto"/>
         <w:rPr>
           <w:rFonts w:ascii="Arvo" w:hAnsi="Arvo"/>
           <w:b/>
@@ -582,6 +705,15 @@
           <w:sz w:val="20"/>
           <w:szCs w:val="20"/>
         </w:rPr>
+      </w:pPr>
+      <w:r>
+        <w:rPr>
+          <w:rFonts w:ascii="Arvo" w:hAnsi="Arvo"/>
+          <w:b/>
+          <w:bCs/>
+          <w:sz w:val="20"/>
+          <w:szCs w:val="20"/>
+        </w:rPr>
         <w:t xml:space="preserve">Prazos de Entrega/SLA: </w:t>
       </w:r>
     </w:p>
@@ -649,7 +781,7 @@
           <w:sz w:val="2"/>
           <w:szCs w:val="2"/>
         </w:rPr>
-        <w:t>[SE_CONTENCIOSA]</w:t>
+        <w:t>[SE_CONTENCIOSA_ESCOPO_UNICO]</w:t>
       </w:r>
     </w:p>
     <w:p>
@@ -742,17 +874,6 @@
     </w:p>
     <w:p>
       <w:pPr>
-        <w:snapToGrid w:val="0"/>
-        <w:spacing w:line="276" w:lineRule="auto"/>
-        <w:rPr>
-          <w:rFonts w:ascii="Arvo" w:hAnsi="Arvo"/>
-          <w:sz w:val="20"/>
-          <w:szCs w:val="20"/>
-        </w:rPr>
-      </w:pPr>
-    </w:p>
-    <w:p>
-      <w:pPr>
         <w:spacing w:line="276" w:lineRule="auto"/>
         <w:rPr>
           <w:rFonts w:ascii="Arvo" w:hAnsi="Arvo"/>
@@ -766,7 +887,152 @@
           <w:sz w:val="2"/>
           <w:szCs w:val="2"/>
         </w:rPr>
-        <w:t>[SE_CONSULTIVA]</w:t>
+        <w:t>[SE_CONTENCIOSA_MULTI_ESCOPOS]</w:t>
+      </w:r>
+    </w:p>
+    <w:p>
+      <w:pPr>
+        <w:spacing w:line="276" w:lineRule="auto"/>
+        <w:rPr>
+          <w:rFonts w:ascii="Arvo" w:hAnsi="Arvo"/>
+          <w:sz w:val="2"/>
+          <w:szCs w:val="2"/>
+        </w:rPr>
+      </w:pPr>
+      <w:r>
+        <w:rPr>
+          <w:rFonts w:ascii="Arvo" w:hAnsi="Arvo"/>
+          <w:sz w:val="2"/>
+          <w:szCs w:val="2"/>
+        </w:rPr>
+        <w:t>[PARA_CADA_ESCOPO_CONTENCIOSO]</w:t>
+      </w:r>
+    </w:p>
+    <w:p>
+      <w:pPr>
+        <w:spacing w:line="276" w:lineRule="auto"/>
+        <w:rPr>
+          <w:rFonts w:ascii="Arvo" w:hAnsi="Arvo"/>
+          <w:b/>
+          <w:bCs/>
+          <w:sz w:val="20"/>
+          <w:szCs w:val="20"/>
+        </w:rPr>
+        <w:jc w:val="both"/>
+      </w:pPr>
+      <w:r>
+        <w:rPr>
+          <w:rFonts w:ascii="Arvo" w:hAnsi="Arvo"/>
+          <w:b/>
+          <w:bCs/>
+          <w:sz w:val="20"/>
+          <w:szCs w:val="20"/>
+        </w:rPr>
+        <w:t xml:space="preserve">Escopo Contencioso [ESCOPO_LETRA]:</w:t>
+      </w:r>
+    </w:p>
+    <w:p>
+      <w:pPr>
+        <w:spacing w:line="276" w:lineRule="auto"/>
+        <w:rPr>
+          <w:rFonts w:ascii="Arvo" w:hAnsi="Arvo"/>
+          <w:sz w:val="20"/>
+          <w:szCs w:val="20"/>
+        </w:rPr>
+      </w:pPr>
+    </w:p>
+    <w:p>
+      <w:pPr>
+        <w:spacing w:line="276" w:lineRule="auto"/>
+        <w:rPr>
+          <w:rFonts w:ascii="Arvo" w:hAnsi="Arvo"/>
+          <w:sz w:val="20"/>
+          <w:szCs w:val="20"/>
+        </w:rPr>
+        <w:jc w:val="both"/>
+      </w:pPr>
+      <w:r>
+        <w:rPr>
+          <w:rFonts w:ascii="Arvo" w:hAnsi="Arvo"/>
+          <w:sz w:val="20"/>
+          <w:szCs w:val="20"/>
+        </w:rPr>
+        <w:t xml:space="preserve">[ESCOPO_DESCRICAO]</w:t>
+      </w:r>
+    </w:p>
+    <w:p>
+      <w:pPr>
+        <w:spacing w:line="276" w:lineRule="auto"/>
+        <w:rPr>
+          <w:rFonts w:ascii="Arvo" w:hAnsi="Arvo"/>
+          <w:sz w:val="20"/>
+          <w:szCs w:val="20"/>
+        </w:rPr>
+      </w:pPr>
+    </w:p>
+    <w:p>
+      <w:pPr>
+        <w:spacing w:line="276" w:lineRule="auto"/>
+        <w:rPr>
+          <w:rFonts w:ascii="Arvo" w:hAnsi="Arvo"/>
+          <w:sz w:val="2"/>
+          <w:szCs w:val="2"/>
+        </w:rPr>
+      </w:pPr>
+      <w:r>
+        <w:rPr>
+          <w:rFonts w:ascii="Arvo" w:hAnsi="Arvo"/>
+          <w:sz w:val="2"/>
+          <w:szCs w:val="2"/>
+        </w:rPr>
+        <w:t>[FIM_PARA_CADA_BLOCO]</w:t>
+      </w:r>
+    </w:p>
+    <w:p>
+      <w:pPr>
+        <w:spacing w:line="276" w:lineRule="auto"/>
+        <w:rPr>
+          <w:rFonts w:ascii="Arvo" w:hAnsi="Arvo"/>
+          <w:sz w:val="2"/>
+          <w:szCs w:val="2"/>
+        </w:rPr>
+      </w:pPr>
+      <w:r>
+        <w:rPr>
+          <w:rFonts w:ascii="Arvo" w:hAnsi="Arvo"/>
+          <w:sz w:val="2"/>
+          <w:szCs w:val="2"/>
+        </w:rPr>
+        <w:t>[FIM_SE]</w:t>
+      </w:r>
+    </w:p>
+    <w:p>
+      <w:pPr>
+        <w:snapToGrid w:val="0"/>
+        <w:spacing w:line="276" w:lineRule="auto"/>
+        <w:rPr>
+          <w:rFonts w:ascii="Arvo" w:hAnsi="Arvo"/>
+          <w:sz w:val="20"/>
+          <w:szCs w:val="20"/>
+        </w:rPr>
+      </w:pPr>
+    </w:p>
+    <w:p>
+      <w:pPr>
+        <w:spacing w:line="276" w:lineRule="auto"/>
+        <w:rPr>
+          <w:rFonts w:ascii="Arvo" w:hAnsi="Arvo"/>
+          <w:sz w:val="2"/>
+          <w:szCs w:val="2"/>
+        </w:rPr>
+      </w:pPr>
+      <w:r>
+        <w:rPr>
+          <w:rFonts w:ascii="Arvo" w:hAnsi="Arvo"/>
+          <w:sz w:val="2"/>
+          <w:szCs w:val="2"/>
+        </w:rPr>
+        <w:t>[SE_CONSULTIVA_FORMA_UNICA]</w:t>
       </w:r>
     </w:p>
     <w:p>
@@ -2424,16 +2690,6 @@
         <w:spacing w:line="276" w:lineRule="auto"/>
         <w:rPr>
           <w:rFonts w:ascii="Arvo" w:hAnsi="Arvo"/>
-          <w:sz w:val="20"/>
-          <w:szCs w:val="20"/>
-        </w:rPr>
-      </w:pPr>
-    </w:p>
-    <w:p>
-      <w:pPr>
-        <w:spacing w:line="276" w:lineRule="auto"/>
-        <w:rPr>
-          <w:rFonts w:ascii="Arvo" w:hAnsi="Arvo"/>
           <w:sz w:val="2"/>
           <w:szCs w:val="2"/>
         </w:rPr>
@@ -2444,7 +2700,108 @@
           <w:sz w:val="2"/>
           <w:szCs w:val="2"/>
         </w:rPr>
-        <w:t>[SE_CONTENCIOSA]</w:t>
+        <w:t>[SE_CONSULTIVA_FORMA_POR_ESCOPO]</w:t>
+      </w:r>
+    </w:p>
+    <w:p>
+      <w:pPr>
+        <w:spacing w:line="276" w:lineRule="auto"/>
+        <w:rPr>
+          <w:rFonts w:ascii="Arvo" w:hAnsi="Arvo"/>
+          <w:sz w:val="2"/>
+          <w:szCs w:val="2"/>
+        </w:rPr>
+      </w:pPr>
+      <w:r>
+        <w:rPr>
+          <w:rFonts w:ascii="Arvo" w:hAnsi="Arvo"/>
+          <w:sz w:val="2"/>
+          <w:szCs w:val="2"/>
+        </w:rPr>
+        <w:t>[PARA_CADA_HONORARIO_CONSULTIVO]</w:t>
+      </w:r>
+    </w:p>
+    <w:p>
+      <w:pPr>
+        <w:spacing w:line="276" w:lineRule="auto"/>
+        <w:rPr>
+          <w:rFonts w:ascii="Arvo" w:hAnsi="Arvo"/>
+          <w:sz w:val="20"/>
+          <w:szCs w:val="20"/>
+        </w:rPr>
+        <w:jc w:val="both"/>
+      </w:pPr>
+      <w:r>
+        <w:rPr>
+          <w:rFonts w:ascii="Arvo" w:hAnsi="Arvo"/>
+          <w:sz w:val="20"/>
+          <w:szCs w:val="20"/>
+        </w:rPr>
+        <w:t xml:space="preserve">[HONORARIO_BLOCO]</w:t>
+      </w:r>
+    </w:p>
+    <w:p>
+      <w:pPr>
+        <w:spacing w:line="276" w:lineRule="auto"/>
+        <w:rPr>
+          <w:rFonts w:ascii="Arvo" w:hAnsi="Arvo"/>
+          <w:sz w:val="2"/>
+          <w:szCs w:val="2"/>
+        </w:rPr>
+      </w:pPr>
+      <w:r>
+        <w:rPr>
+          <w:rFonts w:ascii="Arvo" w:hAnsi="Arvo"/>
+          <w:sz w:val="2"/>
+          <w:szCs w:val="2"/>
+        </w:rPr>
+        <w:t>[FIM_PARA_CADA_BLOCO]</w:t>
+      </w:r>
+    </w:p>
+    <w:p>
+      <w:pPr>
+        <w:spacing w:line="276" w:lineRule="auto"/>
+        <w:rPr>
+          <w:rFonts w:ascii="Arvo" w:hAnsi="Arvo"/>
+          <w:sz w:val="2"/>
+          <w:szCs w:val="2"/>
+        </w:rPr>
+      </w:pPr>
+      <w:r>
+        <w:rPr>
+          <w:rFonts w:ascii="Arvo" w:hAnsi="Arvo"/>
+          <w:sz w:val="2"/>
+          <w:szCs w:val="2"/>
+        </w:rPr>
+        <w:t>[FIM_SE]</w:t>
+      </w:r>
+    </w:p>
+    <w:p>
+      <w:pPr>
+        <w:spacing w:line="276" w:lineRule="auto"/>
+        <w:rPr>
+          <w:rFonts w:ascii="Arvo" w:hAnsi="Arvo"/>
+          <w:sz w:val="20"/>
+          <w:szCs w:val="20"/>
+        </w:rPr>
+      </w:pPr>
+    </w:p>
+    <w:p>
+      <w:pPr>
+        <w:spacing w:line="276" w:lineRule="auto"/>
+        <w:rPr>
+          <w:rFonts w:ascii="Arvo" w:hAnsi="Arvo"/>
+          <w:sz w:val="2"/>
+          <w:szCs w:val="2"/>
+        </w:rPr>
+      </w:pPr>
+      <w:r>
+        <w:rPr>
+          <w:rFonts w:ascii="Arvo" w:hAnsi="Arvo"/>
+          <w:sz w:val="2"/>
+          <w:szCs w:val="2"/>
+        </w:rPr>
+        <w:t>[SE_CONTENCIOSA_FORMA_UNICA]</w:t>
       </w:r>
     </w:p>
     <w:p>
@@ -4405,6 +4762,42 @@
           <w:sz w:val="2"/>
           <w:szCs w:val="2"/>
         </w:rPr>
+        <w:t>[FIM_SE]</w:t>
+      </w:r>
+    </w:p>
+    <w:p>
+      <w:pPr>
+        <w:spacing w:line="276" w:lineRule="auto"/>
+        <w:rPr>
+          <w:rFonts w:ascii="Arvo" w:hAnsi="Arvo"/>
+          <w:sz w:val="2"/>
+          <w:szCs w:val="2"/>
+        </w:rPr>
+      </w:pPr>
+      <w:r>
+        <w:rPr>
+          <w:rFonts w:ascii="Arvo" w:hAnsi="Arvo"/>
+          <w:sz w:val="2"/>
+          <w:szCs w:val="2"/>
+        </w:rPr>
+        <w:t>[SE_CONTENCIOSA]</w:t>
+      </w:r>
+    </w:p>
+    <w:p>
+      <w:pPr>
+        <w:spacing w:line="276" w:lineRule="auto"/>
+        <w:rPr>
+          <w:rFonts w:ascii="Arvo" w:hAnsi="Arvo"/>
+          <w:sz w:val="2"/>
+          <w:szCs w:val="2"/>
+        </w:rPr>
+      </w:pPr>
+      <w:r>
+        <w:rPr>
+          <w:rFonts w:ascii="Arvo" w:hAnsi="Arvo"/>
+          <w:sz w:val="2"/>
+          <w:szCs w:val="2"/>
+        </w:rPr>
         <w:t>[SE_CONT_EXITO]</w:t>
       </w:r>
     </w:p>
@@ -5384,6 +5777,97 @@
           <w:szCs w:val="2"/>
         </w:rPr>
         <w:t>[FIM_SE]</w:t>
+      </w:r>
+    </w:p>
+    <w:p>
+      <w:pPr>
+        <w:spacing w:line="276" w:lineRule="auto"/>
+        <w:rPr>
+          <w:rFonts w:ascii="Arvo" w:hAnsi="Arvo"/>
+          <w:sz w:val="2"/>
+          <w:szCs w:val="2"/>
+        </w:rPr>
+      </w:pPr>
+      <w:r>
+        <w:rPr>
+          <w:rFonts w:ascii="Arvo" w:hAnsi="Arvo"/>
+          <w:sz w:val="2"/>
+          <w:szCs w:val="2"/>
+        </w:rPr>
+        <w:t>[FIM_SE]</w:t>
+      </w:r>
+    </w:p>
+    <w:p>
+      <w:pPr>
+        <w:spacing w:line="276" w:lineRule="auto"/>
+        <w:rPr>
+          <w:rFonts w:ascii="Arvo" w:hAnsi="Arvo"/>
+          <w:sz w:val="2"/>
+          <w:szCs w:val="2"/>
+        </w:rPr>
+      </w:pPr>
+      <w:r>
+        <w:rPr>
+          <w:rFonts w:ascii="Arvo" w:hAnsi="Arvo"/>
+          <w:sz w:val="2"/>
+          <w:szCs w:val="2"/>
+        </w:rPr>
+        <w:t>[SE_CONTENCIOSA_FORMA_POR_ESCOPO]</w:t>
+      </w:r>
+    </w:p>
+    <w:p>
+      <w:pPr>
+        <w:spacing w:line="276" w:lineRule="auto"/>
+        <w:rPr>
+          <w:rFonts w:ascii="Arvo" w:hAnsi="Arvo"/>
+          <w:sz w:val="2"/>
+          <w:szCs w:val="2"/>
+        </w:rPr>
+      </w:pPr>
+      <w:r>
+        <w:rPr>
+          <w:rFonts w:ascii="Arvo" w:hAnsi="Arvo"/>
+          <w:sz w:val="2"/>
+          <w:szCs w:val="2"/>
+        </w:rPr>
+        <w:t>[PARA_CADA_HONORARIO_CONTENCIOSO]</w:t>
+      </w:r>
+    </w:p>
+    <w:p>
+      <w:pPr>
+        <w:spacing w:line="276" w:lineRule="auto"/>
+        <w:rPr>
+          <w:rFonts w:ascii="Arvo" w:hAnsi="Arvo"/>
+          <w:sz w:val="20"/>
+          <w:szCs w:val="20"/>
+        </w:rPr>
+        <w:jc w:val="both"/>
+      </w:pPr>
+      <w:r>
+        <w:rPr>
+          <w:rFonts w:ascii="Arvo" w:hAnsi="Arvo"/>
+          <w:sz w:val="20"/>
+          <w:szCs w:val="20"/>
+        </w:rPr>
+        <w:t xml:space="preserve">[HONORARIO_BLOCO]</w:t>
+      </w:r>
+    </w:p>
+    <w:p>
+      <w:pPr>
+        <w:spacing w:line="276" w:lineRule="auto"/>
+        <w:rPr>
+          <w:rFonts w:ascii="Arvo" w:hAnsi="Arvo"/>
+          <w:sz w:val="2"/>
+          <w:szCs w:val="2"/>
+        </w:rPr>
+      </w:pPr>
+      <w:r>
+        <w:rPr>
+          <w:rFonts w:ascii="Arvo" w:hAnsi="Arvo"/>
+          <w:sz w:val="2"/>
+          <w:szCs w:val="2"/>
+        </w:rPr>
+        <w:t>[FIM_PARA_CADA_BLOCO]</w:t>
       </w:r>
     </w:p>
     <w:p>

</xml_diff>

<commit_message>
chore: regenera PMRA_Template_Markers.docx após mudanças no Jinja
Markers regerados a partir do template Jinja atualizado, refletindo:
- [SE_HONORARIO_INLINE] / [HONORARIO_INLINE] para subdoc inline
- [SE_*_SECAO_CONSOLIDADA] renomeados após troca de forma_por_escopo
  para show_consolidated na condição
- Justificação aplicada aos parágrafos de texto livre

https://claude.ai/code/session_012snjMX98d8NAZ9MosCsbYN
</commit_message>
<xml_diff>
--- a/resources/templates/PMRA_Template_Markers.docx
+++ b/resources/templates/PMRA_Template_Markers.docx
@@ -504,6 +504,7 @@
           <w:sz w:val="20"/>
           <w:szCs w:val="20"/>
         </w:rPr>
+        <w:jc w:val="both"/>
       </w:pPr>
       <w:r>
         <w:rPr>
@@ -616,6 +617,60 @@
           <w:szCs w:val="20"/>
         </w:rPr>
         <w:t xml:space="preserve">[ESCOPO_DESCRICAO]</w:t>
+      </w:r>
+    </w:p>
+    <w:p>
+      <w:pPr>
+        <w:spacing w:line="276" w:lineRule="auto"/>
+        <w:rPr>
+          <w:rFonts w:ascii="Arvo" w:hAnsi="Arvo"/>
+          <w:sz w:val="2"/>
+          <w:szCs w:val="2"/>
+        </w:rPr>
+      </w:pPr>
+      <w:r>
+        <w:rPr>
+          <w:rFonts w:ascii="Arvo" w:hAnsi="Arvo"/>
+          <w:sz w:val="2"/>
+          <w:szCs w:val="2"/>
+        </w:rPr>
+        <w:t>[SE_HONORARIO_INLINE]</w:t>
+      </w:r>
+    </w:p>
+    <w:p>
+      <w:pPr>
+        <w:spacing w:line="276" w:lineRule="auto"/>
+        <w:rPr>
+          <w:rFonts w:ascii="Arvo" w:hAnsi="Arvo"/>
+          <w:sz w:val="2"/>
+          <w:szCs w:val="2"/>
+        </w:rPr>
+      </w:pPr>
+      <w:r>
+        <w:rPr>
+          <w:rFonts w:ascii="Arvo" w:hAnsi="Arvo"/>
+          <w:sz w:val="2"/>
+          <w:szCs w:val="2"/>
+        </w:rPr>
+        <w:t>[HONORARIO_INLINE]</w:t>
+      </w:r>
+    </w:p>
+    <w:p>
+      <w:pPr>
+        <w:spacing w:line="276" w:lineRule="auto"/>
+        <w:rPr>
+          <w:rFonts w:ascii="Arvo" w:hAnsi="Arvo"/>
+          <w:sz w:val="2"/>
+          <w:szCs w:val="2"/>
+        </w:rPr>
+      </w:pPr>
+      <w:r>
+        <w:rPr>
+          <w:rFonts w:ascii="Arvo" w:hAnsi="Arvo"/>
+          <w:sz w:val="2"/>
+          <w:szCs w:val="2"/>
+        </w:rPr>
+        <w:t>[FIM_SE]</w:t>
       </w:r>
     </w:p>
     <w:p>
@@ -739,6 +794,7 @@
           <w:sz w:val="20"/>
           <w:szCs w:val="20"/>
         </w:rPr>
+        <w:jc w:val="both"/>
       </w:pPr>
       <w:r>
         <w:rPr>
@@ -856,6 +912,7 @@
           <w:sz w:val="20"/>
           <w:szCs w:val="20"/>
         </w:rPr>
+        <w:jc w:val="both"/>
       </w:pPr>
       <w:r>
         <w:rPr>
@@ -970,6 +1027,60 @@
           <w:szCs w:val="20"/>
         </w:rPr>
         <w:t xml:space="preserve">[ESCOPO_DESCRICAO]</w:t>
+      </w:r>
+    </w:p>
+    <w:p>
+      <w:pPr>
+        <w:spacing w:line="276" w:lineRule="auto"/>
+        <w:rPr>
+          <w:rFonts w:ascii="Arvo" w:hAnsi="Arvo"/>
+          <w:sz w:val="2"/>
+          <w:szCs w:val="2"/>
+        </w:rPr>
+      </w:pPr>
+      <w:r>
+        <w:rPr>
+          <w:rFonts w:ascii="Arvo" w:hAnsi="Arvo"/>
+          <w:sz w:val="2"/>
+          <w:szCs w:val="2"/>
+        </w:rPr>
+        <w:t>[SE_HONORARIO_INLINE]</w:t>
+      </w:r>
+    </w:p>
+    <w:p>
+      <w:pPr>
+        <w:spacing w:line="276" w:lineRule="auto"/>
+        <w:rPr>
+          <w:rFonts w:ascii="Arvo" w:hAnsi="Arvo"/>
+          <w:sz w:val="2"/>
+          <w:szCs w:val="2"/>
+        </w:rPr>
+      </w:pPr>
+      <w:r>
+        <w:rPr>
+          <w:rFonts w:ascii="Arvo" w:hAnsi="Arvo"/>
+          <w:sz w:val="2"/>
+          <w:szCs w:val="2"/>
+        </w:rPr>
+        <w:t>[HONORARIO_INLINE]</w:t>
+      </w:r>
+    </w:p>
+    <w:p>
+      <w:pPr>
+        <w:spacing w:line="276" w:lineRule="auto"/>
+        <w:rPr>
+          <w:rFonts w:ascii="Arvo" w:hAnsi="Arvo"/>
+          <w:sz w:val="2"/>
+          <w:szCs w:val="2"/>
+        </w:rPr>
+      </w:pPr>
+      <w:r>
+        <w:rPr>
+          <w:rFonts w:ascii="Arvo" w:hAnsi="Arvo"/>
+          <w:sz w:val="2"/>
+          <w:szCs w:val="2"/>
+        </w:rPr>
+        <w:t>[FIM_SE]</w:t>
       </w:r>
     </w:p>
     <w:p>
@@ -2712,7 +2823,7 @@
           <w:sz w:val="2"/>
           <w:szCs w:val="2"/>
         </w:rPr>
-        <w:t>[SE_CONSULTIVA_FORMA_POR_ESCOPO]</w:t>
+        <w:t>[SE_CONSULTIVA_SECAO_CONSOLIDADA]</w:t>
       </w:r>
     </w:p>
     <w:p>
@@ -5855,7 +5966,7 @@
           <w:sz w:val="2"/>
           <w:szCs w:val="2"/>
         </w:rPr>
-        <w:t>[SE_CONTENCIOSA_FORMA_POR_ESCOPO]</w:t>
+        <w:t>[SE_CONTENCIOSA_SECAO_CONSOLIDADA]</w:t>
       </w:r>
     </w:p>
     <w:p>
@@ -6610,6 +6721,7 @@
           <w:sz w:val="20"/>
           <w:szCs w:val="20"/>
         </w:rPr>
+        <w:jc w:val="both"/>
       </w:pPr>
       <w:r>
         <w:rPr>
@@ -6640,6 +6752,7 @@
           <w:sz w:val="20"/>
           <w:szCs w:val="20"/>
         </w:rPr>
+        <w:jc w:val="both"/>
       </w:pPr>
       <w:r>
         <w:rPr>

</xml_diff>

<commit_message>
chore(template): regenera markers após reestruturação dos honorários inline
Atualiza scripts/markers_map.py com as tags novas introduzidas pela intercalação
de honorários por escopo e regenera PMRA_Template_Markers.docx:

- [TITULO_SECAO]            ← {{escopo.titulo_secao}}
- [SE_CONS_HONORARIO_POR_ESCOPO] ← {%p if consultiva.forma_por_escopo %}
- [SE_CONT_HONORARIO_POR_ESCOPO] ← {%p if contenciosa.forma_por_escopo %}
- [HONORARIO_BLOCO]         ← {{p item.subdoc}} (antes {{p hon.subdoc}})

Round-trip verificado lossless: to_markers (0 tags não mapeadas) e
build_from_markers (0 markers desconhecidos) reconstroem o Jinja byte a byte.

https://claude.ai/code/session_01RpmCw8x5rdmexDii3zpYJQ
</commit_message>
<xml_diff>
--- a/resources/templates/PMRA_Template_Markers.docx
+++ b/resources/templates/PMRA_Template_Markers.docx
@@ -406,7 +406,7 @@
           <w:szCs w:val="20"/>
           <w:u w:val="single"/>
         </w:rPr>
-        <w:t>Escopo de Trabalho</w:t>
+        <w:t>[TITULO_SECAO]</w:t>
       </w:r>
       <w:r>
         <w:rPr>
@@ -627,6 +627,60 @@
           <w:szCs w:val="20"/>
         </w:rPr>
       </w:pPr>
+    </w:p>
+    <w:p>
+      <w:pPr>
+        <w:spacing w:line="276" w:lineRule="auto"/>
+        <w:rPr>
+          <w:rFonts w:ascii="Arvo" w:hAnsi="Arvo"/>
+          <w:sz w:val="2"/>
+          <w:szCs w:val="2"/>
+        </w:rPr>
+      </w:pPr>
+      <w:r>
+        <w:rPr>
+          <w:rFonts w:ascii="Arvo" w:hAnsi="Arvo"/>
+          <w:sz w:val="2"/>
+          <w:szCs w:val="2"/>
+        </w:rPr>
+        <w:t>[SE_CONS_HONORARIO_POR_ESCOPO]</w:t>
+      </w:r>
+    </w:p>
+    <w:p>
+      <w:pPr>
+        <w:spacing w:line="276" w:lineRule="auto"/>
+        <w:rPr>
+          <w:rFonts w:ascii="Arvo" w:hAnsi="Arvo"/>
+          <w:sz w:val="2"/>
+          <w:szCs w:val="2"/>
+        </w:rPr>
+      </w:pPr>
+      <w:r>
+        <w:rPr>
+          <w:rFonts w:ascii="Arvo" w:hAnsi="Arvo"/>
+          <w:sz w:val="2"/>
+          <w:szCs w:val="2"/>
+        </w:rPr>
+        <w:t>[HONORARIO_BLOCO]</w:t>
+      </w:r>
+    </w:p>
+    <w:p>
+      <w:pPr>
+        <w:spacing w:line="276" w:lineRule="auto"/>
+        <w:rPr>
+          <w:rFonts w:ascii="Arvo" w:hAnsi="Arvo"/>
+          <w:sz w:val="2"/>
+          <w:szCs w:val="2"/>
+        </w:rPr>
+      </w:pPr>
+      <w:r>
+        <w:rPr>
+          <w:rFonts w:ascii="Arvo" w:hAnsi="Arvo"/>
+          <w:sz w:val="2"/>
+          <w:szCs w:val="2"/>
+        </w:rPr>
+        <w:t>[FIM_SE]</w:t>
+      </w:r>
     </w:p>
     <w:p>
       <w:pPr>
@@ -981,6 +1035,60 @@
           <w:szCs w:val="20"/>
         </w:rPr>
       </w:pPr>
+    </w:p>
+    <w:p>
+      <w:pPr>
+        <w:spacing w:line="276" w:lineRule="auto"/>
+        <w:rPr>
+          <w:rFonts w:ascii="Arvo" w:hAnsi="Arvo"/>
+          <w:sz w:val="2"/>
+          <w:szCs w:val="2"/>
+        </w:rPr>
+      </w:pPr>
+      <w:r>
+        <w:rPr>
+          <w:rFonts w:ascii="Arvo" w:hAnsi="Arvo"/>
+          <w:sz w:val="2"/>
+          <w:szCs w:val="2"/>
+        </w:rPr>
+        <w:t>[SE_CONT_HONORARIO_POR_ESCOPO]</w:t>
+      </w:r>
+    </w:p>
+    <w:p>
+      <w:pPr>
+        <w:spacing w:line="276" w:lineRule="auto"/>
+        <w:rPr>
+          <w:rFonts w:ascii="Arvo" w:hAnsi="Arvo"/>
+          <w:sz w:val="2"/>
+          <w:szCs w:val="2"/>
+        </w:rPr>
+      </w:pPr>
+      <w:r>
+        <w:rPr>
+          <w:rFonts w:ascii="Arvo" w:hAnsi="Arvo"/>
+          <w:sz w:val="2"/>
+          <w:szCs w:val="2"/>
+        </w:rPr>
+        <w:t>[HONORARIO_BLOCO]</w:t>
+      </w:r>
+    </w:p>
+    <w:p>
+      <w:pPr>
+        <w:spacing w:line="276" w:lineRule="auto"/>
+        <w:rPr>
+          <w:rFonts w:ascii="Arvo" w:hAnsi="Arvo"/>
+          <w:sz w:val="2"/>
+          <w:szCs w:val="2"/>
+        </w:rPr>
+      </w:pPr>
+      <w:r>
+        <w:rPr>
+          <w:rFonts w:ascii="Arvo" w:hAnsi="Arvo"/>
+          <w:sz w:val="2"/>
+          <w:szCs w:val="2"/>
+        </w:rPr>
+        <w:t>[FIM_SE]</w:t>
+      </w:r>
     </w:p>
     <w:p>
       <w:pPr>
@@ -2677,128 +2785,6 @@
           <w:szCs w:val="2"/>
         </w:rPr>
         <w:t>[FIM_SE]</w:t>
-      </w:r>
-    </w:p>
-    <w:p>
-      <w:pPr>
-        <w:spacing w:line="276" w:lineRule="auto"/>
-        <w:rPr>
-          <w:rFonts w:ascii="Arvo" w:hAnsi="Arvo"/>
-          <w:sz w:val="2"/>
-          <w:szCs w:val="2"/>
-        </w:rPr>
-      </w:pPr>
-      <w:r>
-        <w:rPr>
-          <w:rFonts w:ascii="Arvo" w:hAnsi="Arvo"/>
-          <w:sz w:val="2"/>
-          <w:szCs w:val="2"/>
-        </w:rPr>
-        <w:t>[FIM_SE]</w:t>
-      </w:r>
-    </w:p>
-    <w:p>
-      <w:pPr>
-        <w:spacing w:line="276" w:lineRule="auto"/>
-        <w:rPr>
-          <w:rFonts w:ascii="Arvo" w:hAnsi="Arvo"/>
-          <w:sz w:val="2"/>
-          <w:szCs w:val="2"/>
-        </w:rPr>
-      </w:pPr>
-      <w:r>
-        <w:rPr>
-          <w:rFonts w:ascii="Arvo" w:hAnsi="Arvo"/>
-          <w:sz w:val="2"/>
-          <w:szCs w:val="2"/>
-        </w:rPr>
-        <w:t>[SE_CONSULTIVA_FORMA_POR_ESCOPO]</w:t>
-      </w:r>
-    </w:p>
-    <w:p>
-      <w:pPr>
-        <w:spacing w:line="276" w:lineRule="auto"/>
-        <w:rPr>
-          <w:rFonts w:ascii="Arvo" w:hAnsi="Arvo"/>
-          <w:sz w:val="20"/>
-          <w:szCs w:val="20"/>
-        </w:rPr>
-        <w:jc w:val="both"/>
-      </w:pPr>
-      <w:r>
-        <w:rPr>
-          <w:rFonts w:ascii="Arvo" w:hAnsi="Arvo"/>
-          <w:b/>
-          <w:bCs/>
-          <w:u w:val="single"/>
-          <w:sz w:val="20"/>
-          <w:szCs w:val="20"/>
-        </w:rPr>
-        <w:t xml:space="preserve">Honorários Propostos para os Escopos Consultivos</w:t>
-      </w:r>
-    </w:p>
-    <w:p>
-      <w:pPr>
-        <w:spacing w:line="276" w:lineRule="auto"/>
-        <w:rPr>
-          <w:rFonts w:ascii="Arvo" w:hAnsi="Arvo"/>
-          <w:sz w:val="20"/>
-          <w:szCs w:val="20"/>
-        </w:rPr>
-      </w:pPr>
-    </w:p>
-    <w:p>
-      <w:pPr>
-        <w:spacing w:line="276" w:lineRule="auto"/>
-        <w:rPr>
-          <w:rFonts w:ascii="Arvo" w:hAnsi="Arvo"/>
-          <w:sz w:val="2"/>
-          <w:szCs w:val="2"/>
-        </w:rPr>
-      </w:pPr>
-      <w:r>
-        <w:rPr>
-          <w:rFonts w:ascii="Arvo" w:hAnsi="Arvo"/>
-          <w:sz w:val="2"/>
-          <w:szCs w:val="2"/>
-        </w:rPr>
-        <w:t>[PARA_CADA_HONORARIO_CONSULTIVO]</w:t>
-      </w:r>
-    </w:p>
-    <w:p>
-      <w:pPr>
-        <w:spacing w:line="276" w:lineRule="auto"/>
-        <w:rPr>
-          <w:rFonts w:ascii="Arvo" w:hAnsi="Arvo"/>
-          <w:sz w:val="2"/>
-          <w:szCs w:val="2"/>
-        </w:rPr>
-      </w:pPr>
-      <w:r>
-        <w:rPr>
-          <w:rFonts w:ascii="Arvo" w:hAnsi="Arvo"/>
-          <w:sz w:val="2"/>
-          <w:szCs w:val="2"/>
-        </w:rPr>
-        <w:t>[HONORARIO_BLOCO]</w:t>
-      </w:r>
-    </w:p>
-    <w:p>
-      <w:pPr>
-        <w:spacing w:line="276" w:lineRule="auto"/>
-        <w:rPr>
-          <w:rFonts w:ascii="Arvo" w:hAnsi="Arvo"/>
-          <w:sz w:val="2"/>
-          <w:szCs w:val="2"/>
-        </w:rPr>
-      </w:pPr>
-      <w:r>
-        <w:rPr>
-          <w:rFonts w:ascii="Arvo" w:hAnsi="Arvo"/>
-          <w:sz w:val="2"/>
-          <w:szCs w:val="2"/>
-        </w:rPr>
-        <w:t>[FIM_PARA_CADA_BLOCO]</w:t>
       </w:r>
     </w:p>
     <w:p>
@@ -5820,130 +5806,6 @@
           <w:szCs w:val="2"/>
         </w:rPr>
         <w:t>[FIM_SE]</w:t>
-      </w:r>
-    </w:p>
-    <w:p>
-      <w:pPr>
-        <w:spacing w:line="276" w:lineRule="auto"/>
-        <w:rPr>
-          <w:rFonts w:ascii="Arvo" w:hAnsi="Arvo"/>
-          <w:sz w:val="2"/>
-          <w:szCs w:val="2"/>
-        </w:rPr>
-      </w:pPr>
-      <w:r>
-        <w:rPr>
-          <w:rFonts w:ascii="Arvo" w:hAnsi="Arvo"/>
-          <w:sz w:val="2"/>
-          <w:szCs w:val="2"/>
-        </w:rPr>
-        <w:t>[FIM_SE]</w:t>
-      </w:r>
-    </w:p>
-    <w:p>
-      <w:pPr>
-        <w:spacing w:line="276" w:lineRule="auto"/>
-        <w:rPr>
-          <w:rFonts w:ascii="Arvo" w:hAnsi="Arvo"/>
-          <w:sz w:val="2"/>
-          <w:szCs w:val="2"/>
-        </w:rPr>
-      </w:pPr>
-      <w:r>
-        <w:rPr>
-          <w:rFonts w:ascii="Arvo" w:hAnsi="Arvo"/>
-          <w:sz w:val="2"/>
-          <w:szCs w:val="2"/>
-        </w:rPr>
-        <w:t>[SE_CONTENCIOSA_FORMA_POR_ESCOPO]</w:t>
-      </w:r>
-    </w:p>
-    <w:p>
-      <w:pPr>
-        <w:spacing w:line="276" w:lineRule="auto"/>
-        <w:rPr>
-          <w:rFonts w:ascii="Arvo" w:hAnsi="Arvo"/>
-          <w:b/>
-          <w:bCs/>
-          <w:sz w:val="20"/>
-          <w:szCs w:val="20"/>
-        </w:rPr>
-        <w:jc w:val="both"/>
-      </w:pPr>
-      <w:r>
-        <w:rPr>
-          <w:rFonts w:ascii="Arvo" w:hAnsi="Arvo"/>
-          <w:b/>
-          <w:bCs/>
-          <w:u w:val="single"/>
-          <w:sz w:val="20"/>
-          <w:szCs w:val="20"/>
-        </w:rPr>
-        <w:t xml:space="preserve">Honorários Propostos para os Escopos Contenciosos</w:t>
-      </w:r>
-    </w:p>
-    <w:p>
-      <w:pPr>
-        <w:spacing w:line="276" w:lineRule="auto"/>
-        <w:rPr>
-          <w:rFonts w:ascii="Arvo" w:hAnsi="Arvo"/>
-          <w:sz w:val="20"/>
-          <w:szCs w:val="20"/>
-        </w:rPr>
-      </w:pPr>
-    </w:p>
-    <w:p>
-      <w:pPr>
-        <w:spacing w:line="276" w:lineRule="auto"/>
-        <w:rPr>
-          <w:rFonts w:ascii="Arvo" w:hAnsi="Arvo"/>
-          <w:sz w:val="2"/>
-          <w:szCs w:val="2"/>
-        </w:rPr>
-      </w:pPr>
-      <w:r>
-        <w:rPr>
-          <w:rFonts w:ascii="Arvo" w:hAnsi="Arvo"/>
-          <w:sz w:val="2"/>
-          <w:szCs w:val="2"/>
-        </w:rPr>
-        <w:t>[PARA_CADA_HONORARIO_CONTENCIOSO]</w:t>
-      </w:r>
-    </w:p>
-    <w:p>
-      <w:pPr>
-        <w:spacing w:line="276" w:lineRule="auto"/>
-        <w:rPr>
-          <w:rFonts w:ascii="Arvo" w:hAnsi="Arvo"/>
-          <w:sz w:val="2"/>
-          <w:szCs w:val="2"/>
-        </w:rPr>
-      </w:pPr>
-      <w:r>
-        <w:rPr>
-          <w:rFonts w:ascii="Arvo" w:hAnsi="Arvo"/>
-          <w:sz w:val="2"/>
-          <w:szCs w:val="2"/>
-        </w:rPr>
-        <w:t>[HONORARIO_BLOCO]</w:t>
-      </w:r>
-    </w:p>
-    <w:p>
-      <w:pPr>
-        <w:spacing w:line="276" w:lineRule="auto"/>
-        <w:rPr>
-          <w:rFonts w:ascii="Arvo" w:hAnsi="Arvo"/>
-          <w:sz w:val="2"/>
-          <w:szCs w:val="2"/>
-        </w:rPr>
-      </w:pPr>
-      <w:r>
-        <w:rPr>
-          <w:rFonts w:ascii="Arvo" w:hAnsi="Arvo"/>
-          <w:sz w:val="2"/>
-          <w:szCs w:val="2"/>
-        </w:rPr>
-        <w:t>[FIM_PARA_CADA_BLOCO]</w:t>
       </w:r>
     </w:p>
     <w:p>

</xml_diff>